<commit_message>
Actualización de documentación, RPA y Bimestre 1
</commit_message>
<xml_diff>
--- a/documentacion/informe_final/Informe_Final_Practicas_Preprofesionales.docx
+++ b/documentacion/informe_final/Informe_Final_Practicas_Preprofesionales.docx
@@ -47,6 +47,7 @@
     <w:p>
       <w:pPr>
         <w:pStyle w:val="APA7MAEDICION1"/>
+        <w:ind w:left="707" w:firstLine="2"/>
       </w:pPr>
       <w:r>
         <w:t>Presencial</w:t>
@@ -1654,20 +1655,17 @@
     <w:p>
       <w:pPr>
         <w:pStyle w:val="APA7MAEDICION1"/>
-      </w:pPr>
-    </w:p>
-    <w:p>
-      <w:pPr>
-        <w:pStyle w:val="APA7MAEDICION1"/>
-      </w:pPr>
-      <w:r>
-        <w:lastRenderedPageBreak/>
-        <w:br w:type="page"/>
-      </w:r>
-    </w:p>
-    <w:p>
-      <w:pPr>
-        <w:pStyle w:val="APA7MAEDICION1"/>
+        <w:ind w:firstLine="0"/>
+        <w:rPr>
+          <w:b/>
+          <w:bCs/>
+        </w:rPr>
+      </w:pPr>
+    </w:p>
+    <w:p>
+      <w:pPr>
+        <w:pStyle w:val="APA7MAEDICION1"/>
+        <w:ind w:firstLine="708"/>
       </w:pPr>
       <w:r>
         <w:rPr>
@@ -2180,6 +2178,78 @@
     <w:p>
       <w:pPr>
         <w:pStyle w:val="APA7MAEDICION1"/>
+        <w:rPr>
+          <w:b/>
+          <w:bCs/>
+        </w:rPr>
+      </w:pPr>
+    </w:p>
+    <w:p>
+      <w:pPr>
+        <w:pStyle w:val="APA7MAEDICION1"/>
+        <w:rPr>
+          <w:b/>
+          <w:bCs/>
+        </w:rPr>
+      </w:pPr>
+    </w:p>
+    <w:p>
+      <w:pPr>
+        <w:pStyle w:val="APA7MAEDICION1"/>
+        <w:rPr>
+          <w:b/>
+          <w:bCs/>
+        </w:rPr>
+      </w:pPr>
+    </w:p>
+    <w:p>
+      <w:pPr>
+        <w:pStyle w:val="APA7MAEDICION1"/>
+        <w:rPr>
+          <w:b/>
+          <w:bCs/>
+        </w:rPr>
+      </w:pPr>
+    </w:p>
+    <w:p>
+      <w:pPr>
+        <w:pStyle w:val="APA7MAEDICION1"/>
+        <w:rPr>
+          <w:b/>
+          <w:bCs/>
+        </w:rPr>
+      </w:pPr>
+    </w:p>
+    <w:p>
+      <w:pPr>
+        <w:pStyle w:val="APA7MAEDICION1"/>
+        <w:rPr>
+          <w:b/>
+          <w:bCs/>
+        </w:rPr>
+      </w:pPr>
+    </w:p>
+    <w:p>
+      <w:pPr>
+        <w:pStyle w:val="APA7MAEDICION1"/>
+        <w:rPr>
+          <w:b/>
+          <w:bCs/>
+        </w:rPr>
+      </w:pPr>
+    </w:p>
+    <w:p>
+      <w:pPr>
+        <w:pStyle w:val="APA7MAEDICION1"/>
+        <w:rPr>
+          <w:b/>
+          <w:bCs/>
+        </w:rPr>
+      </w:pPr>
+    </w:p>
+    <w:p>
+      <w:pPr>
+        <w:pStyle w:val="APA7MAEDICION1"/>
       </w:pPr>
       <w:r>
         <w:rPr>
@@ -2235,11 +2305,10 @@
               <w:rPr>
                 <w:noProof/>
               </w:rPr>
-              <w:lastRenderedPageBreak/>
               <w:drawing>
-                <wp:inline distT="0" distB="0" distL="0" distR="0" wp14:anchorId="60503F2B" wp14:editId="5A703444">
-                  <wp:extent cx="5791200" cy="3825240"/>
-                  <wp:effectExtent l="0" t="0" r="0" b="3810"/>
+                <wp:inline distT="0" distB="0" distL="0" distR="0" wp14:anchorId="60503F2B" wp14:editId="1897994F">
+                  <wp:extent cx="5250180" cy="3825240"/>
+                  <wp:effectExtent l="0" t="0" r="7620" b="3810"/>
                   <wp:docPr id="372170686" name="Imagen 1"/>
                   <wp:cNvGraphicFramePr>
                     <a:graphicFrameLocks xmlns:a="http://schemas.openxmlformats.org/drawingml/2006/main" noChangeAspect="1"/>
@@ -2260,7 +2329,7 @@
                         <pic:spPr>
                           <a:xfrm>
                             <a:off x="0" y="0"/>
-                            <a:ext cx="5791200" cy="3825240"/>
+                            <a:ext cx="5250180" cy="3825240"/>
                           </a:xfrm>
                           <a:prstGeom prst="rect">
                             <a:avLst/>
@@ -2298,9 +2367,9 @@
                 <w:color w:val="888888"/>
               </w:rPr>
               <w:drawing>
-                <wp:inline distT="0" distB="0" distL="0" distR="0" wp14:anchorId="179B8DC2" wp14:editId="0530E3AA">
-                  <wp:extent cx="5829300" cy="2362200"/>
-                  <wp:effectExtent l="0" t="0" r="0" b="0"/>
+                <wp:inline distT="0" distB="0" distL="0" distR="0" wp14:anchorId="179B8DC2" wp14:editId="0CC6C95F">
+                  <wp:extent cx="5212080" cy="2362200"/>
+                  <wp:effectExtent l="0" t="0" r="7620" b="0"/>
                   <wp:docPr id="1802523203" name="Imagen 1"/>
                   <wp:cNvGraphicFramePr>
                     <a:graphicFrameLocks xmlns:a="http://schemas.openxmlformats.org/drawingml/2006/main" noChangeAspect="1"/>
@@ -2321,7 +2390,7 @@
                         <pic:spPr>
                           <a:xfrm>
                             <a:off x="0" y="0"/>
-                            <a:ext cx="5829300" cy="2362200"/>
+                            <a:ext cx="5212080" cy="2362200"/>
                           </a:xfrm>
                           <a:prstGeom prst="rect">
                             <a:avLst/>
@@ -2363,48 +2432,7 @@
     <w:p>
       <w:pPr>
         <w:pStyle w:val="APA7MAEDICION1"/>
-        <w:rPr>
-          <w:i/>
-          <w:iCs/>
-        </w:rPr>
-      </w:pPr>
-    </w:p>
-    <w:p>
-      <w:pPr>
-        <w:pStyle w:val="APA7MAEDICION1"/>
-        <w:rPr>
-          <w:b/>
-          <w:bCs/>
-          <w:i/>
-          <w:iCs/>
-        </w:rPr>
-      </w:pPr>
-    </w:p>
-    <w:p>
-      <w:pPr>
-        <w:pStyle w:val="APA7MAEDICION1"/>
-        <w:rPr>
-          <w:b/>
-          <w:bCs/>
-          <w:i/>
-          <w:iCs/>
-        </w:rPr>
-      </w:pPr>
-    </w:p>
-    <w:p>
-      <w:pPr>
-        <w:pStyle w:val="APA7MAEDICION1"/>
-        <w:rPr>
-          <w:b/>
-          <w:bCs/>
-          <w:i/>
-          <w:iCs/>
-        </w:rPr>
-      </w:pPr>
-    </w:p>
-    <w:p>
-      <w:pPr>
-        <w:pStyle w:val="APA7MAEDICION1"/>
+        <w:ind w:firstLine="0"/>
       </w:pPr>
       <w:r>
         <w:rPr>
@@ -2466,10 +2494,9 @@
               <w:rPr>
                 <w:noProof/>
               </w:rPr>
-              <w:lastRenderedPageBreak/>
               <w:drawing>
-                <wp:inline distT="0" distB="0" distL="0" distR="0" wp14:anchorId="1AFF4750" wp14:editId="4E5F9324">
-                  <wp:extent cx="6120130" cy="3825240"/>
+                <wp:inline distT="0" distB="0" distL="0" distR="0" wp14:anchorId="1AFF4750" wp14:editId="32B38CCE">
+                  <wp:extent cx="5341620" cy="3825240"/>
                   <wp:effectExtent l="0" t="0" r="0" b="3810"/>
                   <wp:docPr id="2006230113" name="Imagen 1"/>
                   <wp:cNvGraphicFramePr>
@@ -2491,7 +2518,7 @@
                         <pic:spPr>
                           <a:xfrm>
                             <a:off x="0" y="0"/>
-                            <a:ext cx="6120130" cy="3825240"/>
+                            <a:ext cx="5341620" cy="3825240"/>
                           </a:xfrm>
                           <a:prstGeom prst="rect">
                             <a:avLst/>
@@ -2508,6 +2535,34 @@
             <w:pPr>
               <w:pStyle w:val="APA7MAEDICION1"/>
             </w:pPr>
+            <w:r>
+              <w:rPr>
+                <w:i/>
+                <w:iCs/>
+              </w:rPr>
+              <w:t xml:space="preserve">Tablero de </w:t>
+            </w:r>
+            <w:proofErr w:type="spellStart"/>
+            <w:r>
+              <w:rPr>
+                <w:i/>
+                <w:iCs/>
+              </w:rPr>
+              <w:t>Power</w:t>
+            </w:r>
+            <w:proofErr w:type="spellEnd"/>
+            <w:r>
+              <w:rPr>
+                <w:i/>
+                <w:iCs/>
+              </w:rPr>
+              <w:t xml:space="preserve"> BI con los filtros interactivos por año, provincia y sector, construido sobre las vistas Gold del proyecto.</w:t>
+            </w:r>
+          </w:p>
+          <w:p>
+            <w:pPr>
+              <w:pStyle w:val="APA7MAEDICION1"/>
+            </w:pPr>
           </w:p>
         </w:tc>
       </w:tr>
@@ -2515,38 +2570,8 @@
     <w:p>
       <w:pPr>
         <w:pStyle w:val="APA7MAEDICION1"/>
-      </w:pPr>
-      <w:r>
-        <w:rPr>
-          <w:i/>
-          <w:iCs/>
-        </w:rPr>
-        <w:t xml:space="preserve">Tablero de </w:t>
-      </w:r>
-      <w:proofErr w:type="spellStart"/>
-      <w:r>
-        <w:rPr>
-          <w:i/>
-          <w:iCs/>
-        </w:rPr>
-        <w:t>Power</w:t>
-      </w:r>
-      <w:proofErr w:type="spellEnd"/>
-      <w:r>
-        <w:rPr>
-          <w:i/>
-          <w:iCs/>
-        </w:rPr>
-        <w:t xml:space="preserve"> BI con los filtros interactivos por año, provincia y sector, construido sobre las vistas Gold del proyecto.</w:t>
-      </w:r>
-    </w:p>
-    <w:p>
-      <w:pPr>
-        <w:pStyle w:val="APA7MAEDICION1"/>
-      </w:pPr>
-      <w:r>
-        <w:br w:type="page"/>
-      </w:r>
+        <w:ind w:firstLine="0"/>
+      </w:pPr>
     </w:p>
     <w:p>
       <w:pPr>
@@ -2561,7 +2586,6 @@
           <w:b/>
           <w:bCs/>
         </w:rPr>
-        <w:lastRenderedPageBreak/>
         <w:t>5. ANEXO 2</w:t>
       </w:r>
     </w:p>

</xml_diff>